<commit_message>
final changes made and submitted
</commit_message>
<xml_diff>
--- a/icfd2026/paper/ICFD-5354-1.docx
+++ b/icfd2026/paper/ICFD-5354-1.docx
@@ -72,7 +72,13 @@
         <w:t>, Ekenechukwu</w:t>
       </w:r>
       <w:r>
-        <w:t xml:space="preserve"> Chijioke Okafor</w:t>
+        <w:t xml:space="preserve"> </w:t>
+      </w:r>
+      <w:r>
+        <w:t>C.</w:t>
+      </w:r>
+      <w:r>
+        <w:t xml:space="preserve"> Okafor</w:t>
       </w:r>
       <w:r>
         <w:rPr>
@@ -168,119 +174,6 @@
           <w:rFonts w:eastAsia="ＭＳ 明朝"/>
         </w:rPr>
         <w:t>Motooka</w:t>
-      </w:r>
-      <w:r>
-        <w:rPr>
-          <w:rFonts w:eastAsia="ＭＳ 明朝"/>
-        </w:rPr>
-        <w:t xml:space="preserve">, </w:t>
-      </w:r>
-      <w:r>
-        <w:rPr>
-          <w:rFonts w:eastAsia="ＭＳ 明朝"/>
-        </w:rPr>
-        <w:t>Nishi</w:t>
-      </w:r>
-      <w:r>
-        <w:rPr>
-          <w:rFonts w:eastAsia="ＭＳ 明朝"/>
-        </w:rPr>
-        <w:t xml:space="preserve">-ku, </w:t>
-      </w:r>
-      <w:r>
-        <w:rPr>
-          <w:rFonts w:eastAsia="ＭＳ 明朝"/>
-        </w:rPr>
-        <w:t>Fukuoka</w:t>
-      </w:r>
-      <w:r>
-        <w:rPr>
-          <w:rFonts w:eastAsia="ＭＳ 明朝"/>
-        </w:rPr>
-        <w:t xml:space="preserve">, </w:t>
-      </w:r>
-      <w:r>
-        <w:rPr>
-          <w:rFonts w:eastAsia="ＭＳ 明朝"/>
-        </w:rPr>
-        <w:t>819-0395</w:t>
-      </w:r>
-      <w:r>
-        <w:rPr>
-          <w:rFonts w:eastAsia="ＭＳ 明朝"/>
-        </w:rPr>
-        <w:t>, Japan</w:t>
-      </w:r>
-    </w:p>
-    <w:p>
-      <w:pPr>
-        <w:pStyle w:val="affiliation"/>
-        <w:rPr>
-          <w:rFonts w:eastAsia="ＭＳ 明朝"/>
-        </w:rPr>
-      </w:pPr>
-      <w:r>
-        <w:rPr>
-          <w:rFonts w:eastAsia="ＭＳ 明朝"/>
-          <w:vertAlign w:val="superscript"/>
-        </w:rPr>
-        <w:t>1</w:t>
-      </w:r>
-      <w:r>
-        <w:rPr>
-          <w:rFonts w:eastAsia="ＭＳ 明朝"/>
-        </w:rPr>
-        <w:t>Student</w:t>
-      </w:r>
-    </w:p>
-    <w:p>
-      <w:pPr>
-        <w:pStyle w:val="affiliation"/>
-        <w:rPr>
-          <w:rFonts w:eastAsia="ＭＳ 明朝"/>
-        </w:rPr>
-      </w:pPr>
-      <w:r>
-        <w:rPr>
-          <w:rFonts w:eastAsia="ＭＳ 明朝"/>
-        </w:rPr>
-        <w:t>2</w:t>
-      </w:r>
-      <w:r>
-        <w:rPr>
-          <w:rFonts w:eastAsia="ＭＳ 明朝"/>
-        </w:rPr>
-        <w:t>-</w:t>
-      </w:r>
-      <w:r>
-        <w:rPr>
-          <w:rFonts w:eastAsia="ＭＳ 明朝"/>
-        </w:rPr>
-        <w:t>16</w:t>
-      </w:r>
-      <w:r>
-        <w:rPr>
-          <w:rFonts w:eastAsia="ＭＳ 明朝"/>
-        </w:rPr>
-        <w:t>-</w:t>
-      </w:r>
-      <w:r>
-        <w:rPr>
-          <w:rFonts w:eastAsia="ＭＳ 明朝"/>
-        </w:rPr>
-        <w:t>4</w:t>
-      </w:r>
-      <w:r>
-        <w:rPr>
-          <w:rFonts w:eastAsia="ＭＳ 明朝"/>
-        </w:rPr>
-        <w:t xml:space="preserve">, </w:t>
-      </w:r>
-      <w:r>
-        <w:rPr>
-          <w:rFonts w:eastAsia="ＭＳ 明朝"/>
-        </w:rPr>
-        <w:t>Susenji</w:t>
       </w:r>
       <w:r>
         <w:rPr>
@@ -2645,13 +2538,7 @@
         <w:rPr>
           <w:lang w:val="en-GB"/>
         </w:rPr>
-        <w:t xml:space="preserve"> concentration in the fuel </w:t>
-      </w:r>
-      <w:r>
-        <w:rPr>
-          <w:lang w:val="en-GB"/>
-        </w:rPr>
-        <w:t>mixture is significant.</w:t>
+        <w:t xml:space="preserve"> concentration in the fuel mixture is significant.</w:t>
       </w:r>
     </w:p>
     <w:p>
@@ -2665,7 +2552,13 @@
         <w:rPr>
           <w:lang w:val="en-GB"/>
         </w:rPr>
-        <w:t xml:space="preserve">The primary objective of this work is to develop a robust reduced chemical kinetic mechanism capable of accurately modelling the combustion of </w:t>
+        <w:t xml:space="preserve">The primary objective of this work is to develop a </w:t>
+      </w:r>
+      <w:r>
+        <w:rPr>
+          <w:lang w:val="en-GB"/>
+        </w:rPr>
+        <w:t xml:space="preserve">robust reduced chemical kinetic mechanism capable of accurately modelling the combustion of </w:t>
       </w:r>
       <m:oMath>
         <m:sSub>
@@ -3106,7 +2999,22 @@
         <w:pStyle w:val="Maintext"/>
       </w:pPr>
       <w:r>
-        <w:t xml:space="preserve">In this study, one-dimensional simulations for the unstretched laminar burning velocity, </w:t>
+        <w:t xml:space="preserve">In this study, one-dimensional unstretched </w:t>
+      </w:r>
+      <w:r>
+        <w:t xml:space="preserve">adiabatic </w:t>
+      </w:r>
+      <w:r>
+        <w:t>simulations</w:t>
+      </w:r>
+      <w:r>
+        <w:t xml:space="preserve"> were conducted to evaluate the unstretched </w:t>
+      </w:r>
+      <w:r>
+        <w:t>laminar burning velocity</w:t>
+      </w:r>
+      <w:r>
+        <w:t xml:space="preserve">, </w:t>
       </w:r>
       <m:oMath>
         <m:sSub>
@@ -3137,7 +3045,13 @@
         </m:sSub>
       </m:oMath>
       <w:r>
-        <w:t xml:space="preserve">, of premixed adiabatic flames were simulated using the Premixed Laminar Flame Speed Calculation Model in ANSYS Chemkin-PRO. The computation domain was set 10 cm and </w:t>
+        <w:t>, of</w:t>
+      </w:r>
+      <w:r>
+        <w:t xml:space="preserve"> the</w:t>
+      </w:r>
+      <w:r>
+        <w:t xml:space="preserve"> premixed flames using the Premixed Laminar Flame Speed Calculation Model in ANSYS Chemkin-PRO. The computation domain was set 10 cm and </w:t>
       </w:r>
       <m:oMath>
         <m:sSub>
@@ -6683,7 +6597,31 @@
         <w:rPr>
           <w:rFonts w:eastAsiaTheme="minorEastAsia"/>
         </w:rPr>
-        <w:t xml:space="preserve"> shows that Gotama Mech exhibits an IROP approximately 2.2 times larger Okafor Reduced Mech and the pathway is primarily contributed to by the reaction;</w:t>
+        <w:t xml:space="preserve"> shows that Gotama Mech exhibits an IROP approximately 2.2 times larger</w:t>
+      </w:r>
+      <w:r>
+        <w:rPr>
+          <w:rFonts w:eastAsiaTheme="minorEastAsia"/>
+        </w:rPr>
+        <w:t xml:space="preserve"> than</w:t>
+      </w:r>
+      <w:r>
+        <w:rPr>
+          <w:rFonts w:eastAsiaTheme="minorEastAsia"/>
+        </w:rPr>
+        <w:t xml:space="preserve"> Okafor Reduced Mech and the pathway is primarily </w:t>
+      </w:r>
+      <w:r>
+        <w:rPr>
+          <w:rFonts w:eastAsiaTheme="minorEastAsia"/>
+        </w:rPr>
+        <w:t>dominated</w:t>
+      </w:r>
+      <w:r>
+        <w:rPr>
+          <w:rFonts w:eastAsiaTheme="minorEastAsia"/>
+        </w:rPr>
+        <w:t xml:space="preserve"> by the reaction;</w:t>
       </w:r>
     </w:p>
     <w:p>

</xml_diff>